<commit_message>
Phase 1 stage 1: SW requirements analysis (OEM-SR-001~004)
Derive SWR-005/006/007/008/009/013a/013b/021a/021b from the ASIL B
safety requirements in OEM-SWR-001, using the customer's own SWR-NNN
traceability numbering (with atomicity-driven a/b sub-clauses for
SWR-013/021). Fill SWR-001 (requirements spec), SWR-002 (use cases),
SWR-003 (use case diagram), and TRC-001 (traceability matrix).

Key decisions confirmed by user (recorded in SWR-001 §8):
- Crash (CONFIRMED) takes priority over approach-risk lock
- crash_status=PENDING is treated the same as NONE
- "PC/SIL verification" = this project's own unittest/integration-
  tester/sw-system-tester pipeline
- SWR-013/021 split into a/b sub-requirements for atomicity

Flagged for follow-up: SWR-019 has no mapping anywhere in the OEM
traceability table; Safety Goal identifiers not yet provided by OEM.

Co-Authored-By: Claude Sonnet 5 <noreply@anthropic.com>
</commit_message>
<xml_diff>
--- a/deliverables/SWR-001_SW 요구사항 명세서.docx
+++ b/deliverables/SWR-001_SW 요구사항 명세서.docx
@@ -8,7 +8,7 @@
         <w:jc w:val="left"/>
       </w:pPr>
       <w:r>
-        <w:t>TPL-SWE1-001_SW 요구사항 명세서 템플릿</w:t>
+        <w:t>SWR-001_SW 요구사항 명세서</w:t>
       </w:r>
     </w:p>
     <w:p>
@@ -175,13 +175,7 @@
           </w:tcPr>
           <w:p>
             <w:r>
-              <w:rPr>
-                <w:rFonts w:ascii="맑은 고딕" w:hAnsi="맑은 고딕" w:eastAsia="맑은 고딕"/>
-                <w:b w:val="0"/>
-                <w:i w:val="0"/>
-                <w:color w:val="000000"/>
-                <w:sz w:val="19"/>
-              </w:rPr>
+              <w:t>전자식 차일드락 제어 SW (OEM-A 가상 프로젝트, Phase 1)</w:t>
             </w:r>
           </w:p>
         </w:tc>
@@ -225,13 +219,7 @@
           </w:tcPr>
           <w:p>
             <w:r>
-              <w:rPr>
-                <w:rFonts w:ascii="맑은 고딕" w:hAnsi="맑은 고딕" w:eastAsia="맑은 고딕"/>
-                <w:b w:val="0"/>
-                <w:i w:val="0"/>
-                <w:color w:val="000000"/>
-                <w:sz w:val="19"/>
-              </w:rPr>
+              <w:t>SWR-001_SW 요구사항 명세서</w:t>
             </w:r>
           </w:p>
         </w:tc>
@@ -275,13 +263,7 @@
           </w:tcPr>
           <w:p>
             <w:r>
-              <w:rPr>
-                <w:rFonts w:ascii="맑은 고딕" w:hAnsi="맑은 고딕" w:eastAsia="맑은 고딕"/>
-                <w:b w:val="0"/>
-                <w:i w:val="0"/>
-                <w:color w:val="000000"/>
-                <w:sz w:val="19"/>
-              </w:rPr>
+              <w:t>0.1 (Phase 1 초안, G1 베이스라인 BL-SWR-1.0 이전 단계)</w:t>
             </w:r>
           </w:p>
         </w:tc>
@@ -325,13 +307,7 @@
           </w:tcPr>
           <w:p>
             <w:r>
-              <w:rPr>
-                <w:rFonts w:ascii="맑은 고딕" w:hAnsi="맑은 고딕" w:eastAsia="맑은 고딕"/>
-                <w:b w:val="0"/>
-                <w:i w:val="0"/>
-                <w:color w:val="000000"/>
-                <w:sz w:val="19"/>
-              </w:rPr>
+              <w:t>작성: requirements-analyst(Claude Code) / 검토: 사용자 검토 대기</w:t>
             </w:r>
           </w:p>
         </w:tc>
@@ -372,14 +348,7 @@
         <w:ind w:left="198" w:right="113"/>
       </w:pPr>
       <w:r>
-        <w:rPr>
-          <w:rFonts w:ascii="맑은 고딕" w:hAnsi="맑은 고딕" w:eastAsia="맑은 고딕"/>
-          <w:b w:val="0"/>
-          <w:i/>
-          <w:color w:val="595959"/>
-          <w:sz w:val="19"/>
-        </w:rPr>
-        <w:t>작성 안내: 문서의 작성, 검토, 승인 책임과 적용 베이스라인을 식별한다. 실제 승인 상태와 검토 증거 위치를 구분해 기록한다.</w:t>
+        <w:t>이 문서의 작성·검토·승인 책임과 베이스라인은 아래와 같다.</w:t>
       </w:r>
     </w:p>
     <w:p>
@@ -535,76 +504,51 @@
         <w:tc>
           <w:tcPr>
             <w:tcW w:type="dxa" w:w="1972"/>
-            <w:vAlign w:val="center"/>
-            <w:tcMar>
-              <w:top w:w="90" w:type="dxa"/>
-              <w:start w:w="110" w:type="dxa"/>
-              <w:bottom w:w="90" w:type="dxa"/>
-              <w:end w:w="110" w:type="dxa"/>
-            </w:tcMar>
           </w:tcPr>
           <w:p>
-            <w:r/>
+            <w:r>
+              <w:t>0.1</w:t>
+            </w:r>
           </w:p>
         </w:tc>
         <w:tc>
           <w:tcPr>
             <w:tcW w:type="dxa" w:w="1972"/>
-            <w:vAlign w:val="center"/>
-            <w:tcMar>
-              <w:top w:w="90" w:type="dxa"/>
-              <w:start w:w="110" w:type="dxa"/>
-              <w:bottom w:w="90" w:type="dxa"/>
-              <w:end w:w="110" w:type="dxa"/>
-            </w:tcMar>
           </w:tcPr>
           <w:p>
-            <w:r/>
+            <w:r>
+              <w:t>2026-09-18</w:t>
+            </w:r>
           </w:p>
         </w:tc>
         <w:tc>
           <w:tcPr>
             <w:tcW w:type="dxa" w:w="1972"/>
-            <w:vAlign w:val="center"/>
-            <w:tcMar>
-              <w:top w:w="90" w:type="dxa"/>
-              <w:start w:w="110" w:type="dxa"/>
-              <w:bottom w:w="90" w:type="dxa"/>
-              <w:end w:w="110" w:type="dxa"/>
-            </w:tcMar>
           </w:tcPr>
           <w:p>
-            <w:r/>
+            <w:r>
+              <w:t>requirements-analyst(AI)</w:t>
+            </w:r>
           </w:p>
         </w:tc>
         <w:tc>
           <w:tcPr>
             <w:tcW w:type="dxa" w:w="1972"/>
-            <w:vAlign w:val="center"/>
-            <w:tcMar>
-              <w:top w:w="90" w:type="dxa"/>
-              <w:start w:w="110" w:type="dxa"/>
-              <w:bottom w:w="90" w:type="dxa"/>
-              <w:end w:w="110" w:type="dxa"/>
-            </w:tcMar>
           </w:tcPr>
           <w:p>
-            <w:r/>
+            <w:r>
+              <w:t>Phase 1(OEM-SR-001~004, ASIL B) SWR-005/006/007/008/009/013a/013b/021a/021b 초안 작성</w:t>
+            </w:r>
           </w:p>
         </w:tc>
         <w:tc>
           <w:tcPr>
             <w:tcW w:type="dxa" w:w="1972"/>
-            <w:vAlign w:val="center"/>
-            <w:tcMar>
-              <w:top w:w="90" w:type="dxa"/>
-              <w:start w:w="110" w:type="dxa"/>
-              <w:bottom w:w="90" w:type="dxa"/>
-              <w:end w:w="110" w:type="dxa"/>
-            </w:tcMar>
           </w:tcPr>
           <w:p>
-            <w:r/>
+            <w:r>
+              <w:t>사용자 검토 대기</w:t>
+            </w:r>
           </w:p>
         </w:tc>
       </w:tr>
@@ -762,76 +706,207 @@
         <w:tc>
           <w:tcPr>
             <w:tcW w:type="dxa" w:w="1972"/>
-            <w:vAlign w:val="center"/>
-            <w:tcMar>
-              <w:top w:w="90" w:type="dxa"/>
-              <w:start w:w="110" w:type="dxa"/>
-              <w:bottom w:w="90" w:type="dxa"/>
-              <w:end w:w="110" w:type="dxa"/>
-            </w:tcMar>
           </w:tcPr>
           <w:p>
-            <w:r/>
+            <w:r>
+              <w:t>작성</w:t>
+            </w:r>
           </w:p>
         </w:tc>
         <w:tc>
           <w:tcPr>
             <w:tcW w:type="dxa" w:w="1972"/>
-            <w:vAlign w:val="center"/>
-            <w:tcMar>
-              <w:top w:w="90" w:type="dxa"/>
-              <w:start w:w="110" w:type="dxa"/>
-              <w:bottom w:w="90" w:type="dxa"/>
-              <w:end w:w="110" w:type="dxa"/>
-            </w:tcMar>
           </w:tcPr>
           <w:p>
-            <w:r/>
+            <w:r>
+              <w:t>requirements-analyst 서브에이전트</w:t>
+            </w:r>
           </w:p>
         </w:tc>
         <w:tc>
           <w:tcPr>
             <w:tcW w:type="dxa" w:w="1972"/>
-            <w:vAlign w:val="center"/>
-            <w:tcMar>
-              <w:top w:w="90" w:type="dxa"/>
-              <w:start w:w="110" w:type="dxa"/>
-              <w:bottom w:w="90" w:type="dxa"/>
-              <w:end w:w="110" w:type="dxa"/>
-            </w:tcMar>
           </w:tcPr>
           <w:p>
-            <w:r/>
+            <w:r>
+              <w:t>완료</w:t>
+            </w:r>
           </w:p>
         </w:tc>
         <w:tc>
           <w:tcPr>
             <w:tcW w:type="dxa" w:w="1972"/>
-            <w:vAlign w:val="center"/>
-            <w:tcMar>
-              <w:top w:w="90" w:type="dxa"/>
-              <w:start w:w="110" w:type="dxa"/>
-              <w:bottom w:w="90" w:type="dxa"/>
-              <w:end w:w="110" w:type="dxa"/>
-            </w:tcMar>
           </w:tcPr>
           <w:p>
-            <w:r/>
+            <w:r>
+              <w:t>2026-09-18</w:t>
+            </w:r>
           </w:p>
         </w:tc>
         <w:tc>
           <w:tcPr>
             <w:tcW w:type="dxa" w:w="1972"/>
-            <w:vAlign w:val="center"/>
-            <w:tcMar>
-              <w:top w:w="90" w:type="dxa"/>
-              <w:start w:w="110" w:type="dxa"/>
-              <w:bottom w:w="90" w:type="dxa"/>
-              <w:end w:w="110" w:type="dxa"/>
-            </w:tcMar>
           </w:tcPr>
           <w:p>
-            <w:r/>
+            <w:r>
+              <w:t>본 문서 v0.1</w:t>
+            </w:r>
+          </w:p>
+        </w:tc>
+      </w:tr>
+      <w:tr>
+        <w:tc>
+          <w:tcPr>
+            <w:tcW w:type="dxa" w:w="1972"/>
+          </w:tcPr>
+          <w:p>
+            <w:r>
+              <w:t>기술 검토</w:t>
+            </w:r>
+          </w:p>
+        </w:tc>
+        <w:tc>
+          <w:tcPr>
+            <w:tcW w:type="dxa" w:w="1972"/>
+          </w:tcPr>
+          <w:p>
+            <w:r>
+              <w:t>사용자(프로젝트 책임자)</w:t>
+            </w:r>
+          </w:p>
+        </w:tc>
+        <w:tc>
+          <w:tcPr>
+            <w:tcW w:type="dxa" w:w="1972"/>
+          </w:tcPr>
+          <w:p>
+            <w:r>
+              <w:t>대기</w:t>
+            </w:r>
+          </w:p>
+        </w:tc>
+        <w:tc>
+          <w:tcPr>
+            <w:tcW w:type="dxa" w:w="1972"/>
+          </w:tcPr>
+          <w:p>
+            <w:r>
+              <w:t>-</w:t>
+            </w:r>
+          </w:p>
+        </w:tc>
+        <w:tc>
+          <w:tcPr>
+            <w:tcW w:type="dxa" w:w="1972"/>
+          </w:tcPr>
+          <w:p>
+            <w:r>
+              <w:t>-</w:t>
+            </w:r>
+          </w:p>
+        </w:tc>
+      </w:tr>
+      <w:tr>
+        <w:tc>
+          <w:tcPr>
+            <w:tcW w:type="dxa" w:w="1972"/>
+          </w:tcPr>
+          <w:p>
+            <w:r>
+              <w:t>품질 확인</w:t>
+            </w:r>
+          </w:p>
+        </w:tc>
+        <w:tc>
+          <w:tcPr>
+            <w:tcW w:type="dxa" w:w="1972"/>
+          </w:tcPr>
+          <w:p>
+            <w:r>
+              <w:t>-</w:t>
+            </w:r>
+          </w:p>
+        </w:tc>
+        <w:tc>
+          <w:tcPr>
+            <w:tcW w:type="dxa" w:w="1972"/>
+          </w:tcPr>
+          <w:p>
+            <w:r>
+              <w:t>미수행</w:t>
+            </w:r>
+          </w:p>
+        </w:tc>
+        <w:tc>
+          <w:tcPr>
+            <w:tcW w:type="dxa" w:w="1972"/>
+          </w:tcPr>
+          <w:p>
+            <w:r>
+              <w:t>-</w:t>
+            </w:r>
+          </w:p>
+        </w:tc>
+        <w:tc>
+          <w:tcPr>
+            <w:tcW w:type="dxa" w:w="1972"/>
+          </w:tcPr>
+          <w:p>
+            <w:r>
+              <w:t>-</w:t>
+            </w:r>
+          </w:p>
+        </w:tc>
+      </w:tr>
+      <w:tr>
+        <w:tc>
+          <w:tcPr>
+            <w:tcW w:type="dxa" w:w="1972"/>
+          </w:tcPr>
+          <w:p>
+            <w:r>
+              <w:t>승인</w:t>
+            </w:r>
+          </w:p>
+        </w:tc>
+        <w:tc>
+          <w:tcPr>
+            <w:tcW w:type="dxa" w:w="1972"/>
+          </w:tcPr>
+          <w:p>
+            <w:r>
+              <w:t>-</w:t>
+            </w:r>
+          </w:p>
+        </w:tc>
+        <w:tc>
+          <w:tcPr>
+            <w:tcW w:type="dxa" w:w="1972"/>
+          </w:tcPr>
+          <w:p>
+            <w:r>
+              <w:t>미수행</w:t>
+            </w:r>
+          </w:p>
+        </w:tc>
+        <w:tc>
+          <w:tcPr>
+            <w:tcW w:type="dxa" w:w="1972"/>
+          </w:tcPr>
+          <w:p>
+            <w:r>
+              <w:t>-</w:t>
+            </w:r>
+          </w:p>
+        </w:tc>
+        <w:tc>
+          <w:tcPr>
+            <w:tcW w:type="dxa" w:w="1972"/>
+          </w:tcPr>
+          <w:p>
+            <w:r>
+              <w:t>-</w:t>
+            </w:r>
           </w:p>
         </w:tc>
       </w:tr>
@@ -850,14 +925,7 @@
         <w:ind w:left="198" w:right="113"/>
       </w:pPr>
       <w:r>
-        <w:rPr>
-          <w:rFonts w:ascii="맑은 고딕" w:hAnsi="맑은 고딕" w:eastAsia="맑은 고딕"/>
-          <w:b w:val="0"/>
-          <w:i/>
-          <w:color w:val="595959"/>
-          <w:sz w:val="19"/>
-        </w:rPr>
-        <w:t>작성 안내: Word의 자동 목차 기능으로 아래 제목을 갱신한다. 배포 전 페이지 번호와 제목 수준을 확인한다.</w:t>
+        <w:t>아래는 이 문서의 목차이다(Word에서 열람 시 자동 목차 갱신 가능).</w:t>
       </w:r>
     </w:p>
     <w:p>
@@ -874,14 +942,7 @@
         <w:ind w:left="198" w:right="113"/>
       </w:pPr>
       <w:r>
-        <w:rPr>
-          <w:rFonts w:ascii="맑은 고딕" w:hAnsi="맑은 고딕" w:eastAsia="맑은 고딕"/>
-          <w:b w:val="0"/>
-          <w:i/>
-          <w:color w:val="595959"/>
-          <w:sz w:val="19"/>
-        </w:rPr>
-        <w:t>작성 안내: 이 문서가 필요한 이유와 적용 대상, 사용 시점을 요약한다.</w:t>
+        <w:t>이 문서의 목적, 적용범위, 적용 경계는 아래 1.1~1.3절과 같다.</w:t>
       </w:r>
     </w:p>
     <w:p>
@@ -898,14 +959,7 @@
         <w:ind w:left="198" w:right="113"/>
       </w:pPr>
       <w:r>
-        <w:rPr>
-          <w:rFonts w:ascii="맑은 고딕" w:hAnsi="맑은 고딕" w:eastAsia="맑은 고딕"/>
-          <w:b w:val="0"/>
-          <w:i/>
-          <w:color w:val="595959"/>
-          <w:sz w:val="19"/>
-        </w:rPr>
-        <w:t>작성 안내: 문서가 지원하는 개발 또는 검증 활동과 기대 결과를 기술한다.</w:t>
+        <w:t>가상 OEM-A가 OEM-SWR-001 사양서로 내려준 전자식 차일드락 제어 SW 요구사항 중, Phase 1(ASIL B 안전 핵심 로직: OEM-SR-001~004)을 SW 요구사항(SWR) 수준으로 구체화하여, 이후 아키텍처 설계(SWE.2)·상세설계(SWE.3)·구현·시험의 근거로 삼는다.</w:t>
       </w:r>
     </w:p>
     <w:p>
@@ -922,14 +976,15 @@
         <w:ind w:left="198" w:right="113"/>
       </w:pPr>
       <w:r>
+        <w:t>대한민국 판매용 가상 OEM-A 승용차의 후석 좌/우 전자식 차일드락 제어 SW 중, 충돌 시 긴급 해제(SR-001), 후측방 접근위험 시 잠금 유지(SR-002), 안전 입력 유효성/freshness 검증(SR-003), 센서 고장 시 출력 유지(SR-004)에 대응하는 SW 요구사항을 다룬다.</w:t>
+      </w:r>
+    </w:p>
+    <w:p>
+      <w:r>
         <w:rPr>
-          <w:rFonts w:ascii="맑은 고딕" w:hAnsi="맑은 고딕" w:eastAsia="맑은 고딕"/>
           <w:b w:val="0"/>
-          <w:i/>
-          <w:color w:val="595959"/>
-          <w:sz w:val="19"/>
         </w:rPr>
-        <w:t>작성 안내: 적용할 제품, 소프트웨어 구성요소, 생명주기 단계와 대상 조직을 명시한다.</w:t>
+        <w:t>OEM-FR(운전자 명령 등 QM 기능)과 OEM-NFR(결정론, 이력 저장)은 Phase 2·3에서 이 문서의 이후 리비전에 추가된다.</w:t>
       </w:r>
     </w:p>
     <w:p>
@@ -946,14 +1001,15 @@
         <w:ind w:left="198" w:right="113"/>
       </w:pPr>
       <w:r>
+        <w:t>HIL, 실차, 타깃 ECU, 시스템/HW 개발, ISO 26262 Part 3 HARA, 공식 심사·인증은 범위 밖이다(OEM-SWR-001 1.3절과 동일).</w:t>
+      </w:r>
+    </w:p>
+    <w:p>
+      <w:r>
         <w:rPr>
-          <w:rFonts w:ascii="맑은 고딕" w:hAnsi="맑은 고딕" w:eastAsia="맑은 고딕"/>
           <w:b w:val="0"/>
-          <w:i/>
-          <w:color w:val="595959"/>
-          <w:sz w:val="19"/>
         </w:rPr>
-        <w:t>작성 안내: 포함 범위와 제외 범위, 외부 조직이나 상위 수준 산출물과의 경계를 구분한다.</w:t>
+        <w:t>PC/SIL 검증은 별도 상용 툴체인이 아니라 이 프로젝트의 Python 3.14 기반 unittest + integration-tester/sw-system-tester 파이프라인으로 수행한다(2026-09-18 사용자 확정).</w:t>
       </w:r>
     </w:p>
     <w:p>
@@ -970,14 +1026,7 @@
         <w:ind w:left="198" w:right="113"/>
       </w:pPr>
       <w:r>
-        <w:rPr>
-          <w:rFonts w:ascii="맑은 고딕" w:hAnsi="맑은 고딕" w:eastAsia="맑은 고딕"/>
-          <w:b w:val="0"/>
-          <w:i/>
-          <w:color w:val="595959"/>
-          <w:sz w:val="19"/>
-        </w:rPr>
-        <w:t>작성 안내: 요구사항 문장 형식, 식별 규칙, 품질 기준과 검토 방법을 정의한다.</w:t>
+        <w:t>요구사항 식별 규칙과 품질 판정 기준은 아래 2.1~2.2절과 같다.</w:t>
       </w:r>
     </w:p>
     <w:p>
@@ -994,14 +1043,23 @@
         <w:ind w:left="198" w:right="113"/>
       </w:pPr>
       <w:r>
+        <w:t>요구사항 ID는 OEM-SWR-001 사양서 9장 추적성표가 이미 지정한 SWR-NNN 체계를 그대로 사용한다 (공급자 자체 REQ-F-NNN/REQ-NF-NNN 체계 대신 고객 지정 번호를 채택; 유형 구분은 4장 표의 "유형" 열로 표기).</w:t>
+      </w:r>
+    </w:p>
+    <w:p>
+      <w:r>
         <w:rPr>
-          <w:rFonts w:ascii="맑은 고딕" w:hAnsi="맑은 고딕" w:eastAsia="맑은 고딕"/>
           <w:b w:val="0"/>
-          <w:i/>
-          <w:color w:val="595959"/>
-          <w:sz w:val="19"/>
         </w:rPr>
-        <w:t>작성 안내: 요구사항 ID, 버전, 상태, 우선순위와 변경 통제 방법을 기록한다.</w:t>
+        <w:t>한 SWR ID가 원자성 원칙(§2.2)에 따라 여러 하위 동작으로 분리되어야 하는 경우 SWR-NNNa, SWR-NNNb ...로 서브 절 ID를 부여하고, 상위 SWR-NNN은 OEM 추적표 상의 그룹 ID로 유지한다 (예: SWR-013 → SWR-013a/013b).</w:t>
+      </w:r>
+    </w:p>
+    <w:p>
+      <w:r>
+        <w:rPr>
+          <w:b w:val="0"/>
+        </w:rPr>
+        <w:t>상태값: 초안(작성 완료, 검토 전) / 검토중(리뷰 진행) / 승인(사용자 승인 및 main 브랜치 병합 완료). 번호는 재사용하지 않는다(삭제된 요구사항의 번호도 결번으로 남긴다).</w:t>
       </w:r>
     </w:p>
     <w:p>
@@ -1018,14 +1076,15 @@
         <w:ind w:left="198" w:right="113"/>
       </w:pPr>
       <w:r>
+        <w:t>EARS 구문(유비쿼터스/이벤트기반/상태기반/선택기능/원치않는동작), 원자성(한 문장 = 한 요구), 모호어 금지("적절히", "충분히" 등), 능동태·주어 명시, 용어집 일관성을 요구사항분석 스킬 §2 기준 그대로 적용한다.</w:t>
+      </w:r>
+    </w:p>
+    <w:p>
+      <w:r>
         <w:rPr>
-          <w:rFonts w:ascii="맑은 고딕" w:hAnsi="맑은 고딕" w:eastAsia="맑은 고딕"/>
           <w:b w:val="0"/>
-          <w:i/>
-          <w:color w:val="595959"/>
-          <w:sz w:val="19"/>
         </w:rPr>
-        <w:t>작성 안내: 명확성, 원자성, 일관성, 검증 가능성과 추적성을 판단하는 기준을 적는다.</w:t>
+        <w:t>비기능요구사항(이번 phase 해당 없음, Phase 3에서 추가)은 ISO/IEC 25010 품질특성으로 분류하고, 도구·절차·정량 임계값·판정기준을 모두 갖춘 검증 방안만 인정한다(요구사항분석 스킬 §4).</w:t>
       </w:r>
     </w:p>
     <w:p>
@@ -1042,14 +1101,15 @@
         <w:ind w:left="198" w:right="113"/>
       </w:pPr>
       <w:r>
+        <w:t>상태: 초안 / 검토중 / 승인. 이번 리비전(0.1)의 모든 SWR 항목은 "초안" 상태이며, 사용자 리뷰 승인과 동시에 "승인"으로 전이하고 이 브랜치를 main에 병합한다.</w:t>
+      </w:r>
+    </w:p>
+    <w:p>
+      <w:r>
         <w:rPr>
-          <w:rFonts w:ascii="맑은 고딕" w:hAnsi="맑은 고딕" w:eastAsia="맑은 고딕"/>
           <w:b w:val="0"/>
-          <w:i/>
-          <w:color w:val="595959"/>
-          <w:sz w:val="19"/>
         </w:rPr>
-        <w:t>작성 안내: 사용하는 상태값과 우선순위의 의미, 전이 조건과 승인 책임을 정의한다.</w:t>
+        <w:t>우선순위: 필수 / 권장 / 선택. 이번 phase의 항목은 전부 ASIL B 안전요구로서 "필수"이다.</w:t>
       </w:r>
     </w:p>
     <w:p>
@@ -1066,14 +1126,7 @@
         <w:ind w:left="198" w:right="113"/>
       </w:pPr>
       <w:r>
-        <w:rPr>
-          <w:rFonts w:ascii="맑은 고딕" w:hAnsi="맑은 고딕" w:eastAsia="맑은 고딕"/>
-          <w:b w:val="0"/>
-          <w:i/>
-          <w:color w:val="595959"/>
-          <w:sz w:val="19"/>
-        </w:rPr>
-        <w:t>작성 안내: 각 요구사항의 ID, 출처, 조건, 동작, 정량 기준, 검증 방법과 상태를 작성한다.</w:t>
+        <w:t>이번 phase의 기능/안전 요구사항은 아래 4.1~4.2절과 같다.</w:t>
       </w:r>
     </w:p>
     <w:p>
@@ -1090,14 +1143,7 @@
         <w:ind w:left="198" w:right="113"/>
       </w:pPr>
       <w:r>
-        <w:rPr>
-          <w:rFonts w:ascii="맑은 고딕" w:hAnsi="맑은 고딕" w:eastAsia="맑은 고딕"/>
-          <w:b w:val="0"/>
-          <w:i/>
-          <w:color w:val="595959"/>
-          <w:sz w:val="19"/>
-        </w:rPr>
-        <w:t>작성 안내: 정상 기능과 사용자 또는 외부 시스템 관점의 기대 동작을 검증 가능한 문장으로 기록한다.</w:t>
+        <w:t>이번 리비전(Phase 1)에는 QM 등급 기능요구사항이 없다. OEM-FR-001~007에서 파생되는 SWR 항목은 Phase 2·3에서 이 절에 추가된다.</w:t>
       </w:r>
     </w:p>
     <w:p>
@@ -1114,16 +1160,766 @@
         <w:ind w:left="198" w:right="113"/>
       </w:pPr>
       <w:r>
-        <w:rPr>
-          <w:rFonts w:ascii="맑은 고딕" w:hAnsi="맑은 고딕" w:eastAsia="맑은 고딕"/>
-          <w:b w:val="0"/>
-          <w:i/>
-          <w:color w:val="595959"/>
-          <w:sz w:val="19"/>
-        </w:rPr>
-        <w:t>작성 안내: 상위 안전 요구의 출처와 할당 근거를 유지하고 SW 수준의 조건, 동작과 허용 기준을 기술한다.</w:t>
+        <w:t>OEM-SR-001~004(ASIL B 입력)로부터 파생한 이번 phase의 안전 관련 SW 요구사항은 다음과 같다. ASIL 등급은 OEM-A가 제공한 값을 그대로 상속하며, HARA·ASIL 결정 근거는 재구성하지 않는다.</w:t>
       </w:r>
     </w:p>
+    <w:tbl>
+      <w:tblPr>
+        <w:tblStyle w:val="TableGrid"/>
+        <w:tblW w:type="auto" w:w="0"/>
+        <w:tblLook w:firstColumn="1" w:firstRow="1" w:lastColumn="0" w:lastRow="0" w:noHBand="0" w:noVBand="1" w:val="04A0"/>
+      </w:tblPr>
+      <w:tblGrid>
+        <w:gridCol w:w="1408"/>
+        <w:gridCol w:w="1408"/>
+        <w:gridCol w:w="1408"/>
+        <w:gridCol w:w="1408"/>
+        <w:gridCol w:w="1408"/>
+        <w:gridCol w:w="1408"/>
+        <w:gridCol w:w="1408"/>
+      </w:tblGrid>
+      <w:tr>
+        <w:tc>
+          <w:tcPr>
+            <w:tcW w:type="dxa" w:w="1408"/>
+          </w:tcPr>
+          <w:p>
+            <w:r>
+              <w:rPr>
+                <w:b/>
+              </w:rPr>
+              <w:t>ID</w:t>
+            </w:r>
+          </w:p>
+        </w:tc>
+        <w:tc>
+          <w:tcPr>
+            <w:tcW w:type="dxa" w:w="1408"/>
+          </w:tcPr>
+          <w:p>
+            <w:r>
+              <w:rPr>
+                <w:b/>
+              </w:rPr>
+              <w:t>출처(OEM)</w:t>
+            </w:r>
+          </w:p>
+        </w:tc>
+        <w:tc>
+          <w:tcPr>
+            <w:tcW w:type="dxa" w:w="1408"/>
+          </w:tcPr>
+          <w:p>
+            <w:r>
+              <w:rPr>
+                <w:b/>
+              </w:rPr>
+              <w:t>서술(EARS)</w:t>
+            </w:r>
+          </w:p>
+        </w:tc>
+        <w:tc>
+          <w:tcPr>
+            <w:tcW w:type="dxa" w:w="1408"/>
+          </w:tcPr>
+          <w:p>
+            <w:r>
+              <w:rPr>
+                <w:b/>
+              </w:rPr>
+              <w:t>정량 기준</w:t>
+            </w:r>
+          </w:p>
+        </w:tc>
+        <w:tc>
+          <w:tcPr>
+            <w:tcW w:type="dxa" w:w="1408"/>
+          </w:tcPr>
+          <w:p>
+            <w:r>
+              <w:rPr>
+                <w:b/>
+              </w:rPr>
+              <w:t>ASIL/안전목표</w:t>
+            </w:r>
+          </w:p>
+        </w:tc>
+        <w:tc>
+          <w:tcPr>
+            <w:tcW w:type="dxa" w:w="1408"/>
+          </w:tcPr>
+          <w:p>
+            <w:r>
+              <w:rPr>
+                <w:b/>
+              </w:rPr>
+              <w:t>검증방법</w:t>
+            </w:r>
+          </w:p>
+        </w:tc>
+        <w:tc>
+          <w:tcPr>
+            <w:tcW w:type="dxa" w:w="1408"/>
+          </w:tcPr>
+          <w:p>
+            <w:r>
+              <w:rPr>
+                <w:b/>
+              </w:rPr>
+              <w:t>상태</w:t>
+            </w:r>
+          </w:p>
+        </w:tc>
+      </w:tr>
+      <w:tr>
+        <w:tc>
+          <w:tcPr>
+            <w:tcW w:type="dxa" w:w="1408"/>
+          </w:tcPr>
+          <w:p>
+            <w:r>
+              <w:t>SWR-007</w:t>
+            </w:r>
+          </w:p>
+        </w:tc>
+        <w:tc>
+          <w:tcPr>
+            <w:tcW w:type="dxa" w:w="1408"/>
+          </w:tcPr>
+          <w:p>
+            <w:r>
+              <w:t>OEM-SR-001</w:t>
+            </w:r>
+          </w:p>
+        </w:tc>
+        <w:tc>
+          <w:tcPr>
+            <w:tcW w:type="dxa" w:w="1408"/>
+          </w:tcPr>
+          <w:p>
+            <w:r>
+              <w:t>crash_status가 CONFIRMED로 전이하면, SW는 접근위험으로 인한 잠금 유지(SWR-005/006)를 포함한 다른 모든 판단보다 우선하여 후석 좌 및 우 도어 출력을 RELEASE로 설정해야 한다.</w:t>
+            </w:r>
+          </w:p>
+        </w:tc>
+        <w:tc>
+          <w:tcPr>
+            <w:tcW w:type="dxa" w:w="1408"/>
+          </w:tcPr>
+          <w:p>
+            <w:r>
+              <w:t>전이 후 300ms 이내 두 출력 RELEASE, 이후 입력 주기에도 RELEASE 유지. (2026-09-18 확정: 충돌이 접근위험보다 항상 우선)</w:t>
+            </w:r>
+          </w:p>
+        </w:tc>
+        <w:tc>
+          <w:tcPr>
+            <w:tcW w:type="dxa" w:w="1408"/>
+          </w:tcPr>
+          <w:p>
+            <w:r>
+              <w:t>ASIL B(OEM 입력 상속, HARA 재구성 안 함) / 안전목표: OEM 미제공(SG 식별자 TBD)</w:t>
+            </w:r>
+          </w:p>
+        </w:tc>
+        <w:tc>
+          <w:tcPr>
+            <w:tcW w:type="dxa" w:w="1408"/>
+          </w:tcPr>
+          <w:p>
+            <w:r>
+              <w:t>PC/SIL(unittest+integration-tester), 요구사항 기반 시험</w:t>
+            </w:r>
+          </w:p>
+        </w:tc>
+        <w:tc>
+          <w:tcPr>
+            <w:tcW w:type="dxa" w:w="1408"/>
+          </w:tcPr>
+          <w:p>
+            <w:r>
+              <w:t>초안</w:t>
+            </w:r>
+          </w:p>
+        </w:tc>
+      </w:tr>
+      <w:tr>
+        <w:tc>
+          <w:tcPr>
+            <w:tcW w:type="dxa" w:w="1408"/>
+          </w:tcPr>
+          <w:p>
+            <w:r>
+              <w:t>SWR-008</w:t>
+            </w:r>
+          </w:p>
+        </w:tc>
+        <w:tc>
+          <w:tcPr>
+            <w:tcW w:type="dxa" w:w="1408"/>
+          </w:tcPr>
+          <w:p>
+            <w:r>
+              <w:t>OEM-SR-001</w:t>
+            </w:r>
+          </w:p>
+        </w:tc>
+        <w:tc>
+          <w:tcPr>
+            <w:tcW w:type="dxa" w:w="1408"/>
+          </w:tcPr>
+          <w:p>
+            <w:r>
+              <w:t>crash_status가 PENDING이거나 NONE인 동안, SW는 SWR-007에 의한 강제 RELEASE 동작을 적용하지 않아야 한다(다른 요구사항에 의한 판단은 그대로 유지된다).</w:t>
+            </w:r>
+          </w:p>
+        </w:tc>
+        <w:tc>
+          <w:tcPr>
+            <w:tcW w:type="dxa" w:w="1408"/>
+          </w:tcPr>
+          <w:p>
+            <w:r>
+              <w:t>PENDING/NONE 상태에서 crash 관련 강제 출력 변화 없음.</w:t>
+            </w:r>
+          </w:p>
+        </w:tc>
+        <w:tc>
+          <w:tcPr>
+            <w:tcW w:type="dxa" w:w="1408"/>
+          </w:tcPr>
+          <w:p>
+            <w:r>
+              <w:t>ASIL B / 안전목표 TBD. 비고: 2026-09-18 사용자 확정 - PENDING은 NONE과 동일 취급(가장 보수적 해석). OEM 원문에 PENDING 시 동작이 명시되어 있지 않아 OEM 재확인 필요 항목으로 §8에 기록.</w:t>
+            </w:r>
+          </w:p>
+        </w:tc>
+        <w:tc>
+          <w:tcPr>
+            <w:tcW w:type="dxa" w:w="1408"/>
+          </w:tcPr>
+          <w:p>
+            <w:r>
+              <w:t>PC/SIL, 오류추정(PENDING 입력을 CONFIRMED로 오판하지 않는지 확인)</w:t>
+            </w:r>
+          </w:p>
+        </w:tc>
+        <w:tc>
+          <w:tcPr>
+            <w:tcW w:type="dxa" w:w="1408"/>
+          </w:tcPr>
+          <w:p>
+            <w:r>
+              <w:t>초안</w:t>
+            </w:r>
+          </w:p>
+        </w:tc>
+      </w:tr>
+      <w:tr>
+        <w:tc>
+          <w:tcPr>
+            <w:tcW w:type="dxa" w:w="1408"/>
+          </w:tcPr>
+          <w:p>
+            <w:r>
+              <w:t>SWR-005</w:t>
+            </w:r>
+          </w:p>
+        </w:tc>
+        <w:tc>
+          <w:tcPr>
+            <w:tcW w:type="dxa" w:w="1408"/>
+          </w:tcPr>
+          <w:p>
+            <w:r>
+              <w:t>OEM-SR-002</w:t>
+            </w:r>
+          </w:p>
+        </w:tc>
+        <w:tc>
+          <w:tcPr>
+            <w:tcW w:type="dxa" w:w="1408"/>
+          </w:tcPr>
+          <w:p>
+            <w:r>
+              <w:t>특정 후석 도어의 접근위험 입력이 TRUE인 동안, SW는 해당 도어 출력을 LOCK으로 유지해야 한다. 단, crash_status가 CONFIRMED인 경우 SWR-007이 우선한다.</w:t>
+            </w:r>
+          </w:p>
+        </w:tc>
+        <w:tc>
+          <w:tcPr>
+            <w:tcW w:type="dxa" w:w="1408"/>
+          </w:tcPr>
+          <w:p>
+            <w:r>
+              <w:t>접근위험 TRUE 전이 시점 다음 평가주기부터 해당 출력 LOCK.</w:t>
+            </w:r>
+          </w:p>
+        </w:tc>
+        <w:tc>
+          <w:tcPr>
+            <w:tcW w:type="dxa" w:w="1408"/>
+          </w:tcPr>
+          <w:p>
+            <w:r>
+              <w:t>ASIL B / 안전목표 TBD</w:t>
+            </w:r>
+          </w:p>
+        </w:tc>
+        <w:tc>
+          <w:tcPr>
+            <w:tcW w:type="dxa" w:w="1408"/>
+          </w:tcPr>
+          <w:p>
+            <w:r>
+              <w:t>PC/SIL, 상태기반 시험</w:t>
+            </w:r>
+          </w:p>
+        </w:tc>
+        <w:tc>
+          <w:tcPr>
+            <w:tcW w:type="dxa" w:w="1408"/>
+          </w:tcPr>
+          <w:p>
+            <w:r>
+              <w:t>초안</w:t>
+            </w:r>
+          </w:p>
+        </w:tc>
+      </w:tr>
+      <w:tr>
+        <w:tc>
+          <w:tcPr>
+            <w:tcW w:type="dxa" w:w="1408"/>
+          </w:tcPr>
+          <w:p>
+            <w:r>
+              <w:t>SWR-006</w:t>
+            </w:r>
+          </w:p>
+        </w:tc>
+        <w:tc>
+          <w:tcPr>
+            <w:tcW w:type="dxa" w:w="1408"/>
+          </w:tcPr>
+          <w:p>
+            <w:r>
+              <w:t>OEM-SR-002</w:t>
+            </w:r>
+          </w:p>
+        </w:tc>
+        <w:tc>
+          <w:tcPr>
+            <w:tcW w:type="dxa" w:w="1408"/>
+          </w:tcPr>
+          <w:p>
+            <w:r>
+              <w:t>접근위험이 TRUE인 도어에 해제 요청이 수신되면, SW는 그 요청을 적용하지 않고 해당 출력을 LOCK으로 유지하며 억제 이유코드를 기록해야 한다.</w:t>
+            </w:r>
+          </w:p>
+        </w:tc>
+        <w:tc>
+          <w:tcPr>
+            <w:tcW w:type="dxa" w:w="1408"/>
+          </w:tcPr>
+          <w:p>
+            <w:r>
+              <w:t>억제 발생 시 이유코드 필드에 정의된 코드(예: SUPPRESSED_APPROACH_RISK) 기록.</w:t>
+            </w:r>
+          </w:p>
+        </w:tc>
+        <w:tc>
+          <w:tcPr>
+            <w:tcW w:type="dxa" w:w="1408"/>
+          </w:tcPr>
+          <w:p>
+            <w:r>
+              <w:t>ASIL B / 안전목표 TBD. 비고: OEM-FR-003(10초 재입력 override)은 이 요구사항의 예외 조건이며 Phase 2에서 이 항목을 확장한다 — 이번 phase에는 override 로직을 포함하지 않는다.</w:t>
+            </w:r>
+          </w:p>
+        </w:tc>
+        <w:tc>
+          <w:tcPr>
+            <w:tcW w:type="dxa" w:w="1408"/>
+          </w:tcPr>
+          <w:p>
+            <w:r>
+              <w:t>PC/SIL, 요구사항 기반 시험</w:t>
+            </w:r>
+          </w:p>
+        </w:tc>
+        <w:tc>
+          <w:tcPr>
+            <w:tcW w:type="dxa" w:w="1408"/>
+          </w:tcPr>
+          <w:p>
+            <w:r>
+              <w:t>초안</w:t>
+            </w:r>
+          </w:p>
+        </w:tc>
+      </w:tr>
+      <w:tr>
+        <w:tc>
+          <w:tcPr>
+            <w:tcW w:type="dxa" w:w="1408"/>
+          </w:tcPr>
+          <w:p>
+            <w:r>
+              <w:t>SWR-009</w:t>
+            </w:r>
+          </w:p>
+        </w:tc>
+        <w:tc>
+          <w:tcPr>
+            <w:tcW w:type="dxa" w:w="1408"/>
+          </w:tcPr>
+          <w:p>
+            <w:r>
+              <w:t>OEM-SR-002</w:t>
+            </w:r>
+          </w:p>
+        </w:tc>
+        <w:tc>
+          <w:tcPr>
+            <w:tcW w:type="dxa" w:w="1408"/>
+          </w:tcPr>
+          <w:p>
+            <w:r>
+              <w:t>SW는 후석 좌측과 우측 도어의 접근위험 판정 및 잠금/해제 출력을 서로 독립적으로 산출해야 한다(한쪽 도어의 입력이 반대쪽 출력에 영향을 주지 않는다).</w:t>
+            </w:r>
+          </w:p>
+        </w:tc>
+        <w:tc>
+          <w:tcPr>
+            <w:tcW w:type="dxa" w:w="1408"/>
+          </w:tcPr>
+          <w:p>
+            <w:r>
+              <w:t>좌/우 조합(좌만 TRUE / 우만 TRUE / 둘다 TRUE / 둘다 FALSE) 4가지 모두에서 반대쪽 출력 불변.</w:t>
+            </w:r>
+          </w:p>
+        </w:tc>
+        <w:tc>
+          <w:tcPr>
+            <w:tcW w:type="dxa" w:w="1408"/>
+          </w:tcPr>
+          <w:p>
+            <w:r>
+              <w:t>ASIL B / 안전목표 TBD. 근거: OEM 원문에 직접 문장은 없으나 OEM-IF-003이 좌/우 접근위험을 별도 boolean으로 정의하고 OEM-FR-006(ISOFIX)도 동일한 좌우 독립 패턴을 요구함 — 인터페이스 계약에서 파생.</w:t>
+            </w:r>
+          </w:p>
+        </w:tc>
+        <w:tc>
+          <w:tcPr>
+            <w:tcW w:type="dxa" w:w="1408"/>
+          </w:tcPr>
+          <w:p>
+            <w:r>
+              <w:t>PC/SIL, 동등분할(좌/우 조합)</w:t>
+            </w:r>
+          </w:p>
+        </w:tc>
+        <w:tc>
+          <w:tcPr>
+            <w:tcW w:type="dxa" w:w="1408"/>
+          </w:tcPr>
+          <w:p>
+            <w:r>
+              <w:t>초안</w:t>
+            </w:r>
+          </w:p>
+        </w:tc>
+      </w:tr>
+      <w:tr>
+        <w:tc>
+          <w:tcPr>
+            <w:tcW w:type="dxa" w:w="1408"/>
+          </w:tcPr>
+          <w:p>
+            <w:r>
+              <w:t>SWR-013a</w:t>
+            </w:r>
+          </w:p>
+        </w:tc>
+        <w:tc>
+          <w:tcPr>
+            <w:tcW w:type="dxa" w:w="1408"/>
+          </w:tcPr>
+          <w:p>
+            <w:r>
+              <w:t>OEM-SR-003</w:t>
+            </w:r>
+          </w:p>
+        </w:tc>
+        <w:tc>
+          <w:tcPr>
+            <w:tcW w:type="dxa" w:w="1408"/>
+          </w:tcPr>
+          <w:p>
+            <w:r>
+              <w:t>안전 관련 필수 입력이 200ms를 초과하여 갱신되지 않으면, SW는 100ms 이내 시스템 상태를 DEGRADED로 전이해야 한다.</w:t>
+            </w:r>
+          </w:p>
+        </w:tc>
+        <w:tc>
+          <w:tcPr>
+            <w:tcW w:type="dxa" w:w="1408"/>
+          </w:tcPr>
+          <w:p>
+            <w:r>
+              <w:t>199ms/200ms/201ms 경계에서 정확히 전이 여부 결정, 전이는 100ms 이내 완료.</w:t>
+            </w:r>
+          </w:p>
+        </w:tc>
+        <w:tc>
+          <w:tcPr>
+            <w:tcW w:type="dxa" w:w="1408"/>
+          </w:tcPr>
+          <w:p>
+            <w:r>
+              <w:t>ASIL B / 안전목표 TBD. (원자성 분리: OEM-SR-003 → SWR-013a/013b)</w:t>
+            </w:r>
+          </w:p>
+        </w:tc>
+        <w:tc>
+          <w:tcPr>
+            <w:tcW w:type="dxa" w:w="1408"/>
+          </w:tcPr>
+          <w:p>
+            <w:r>
+              <w:t>PC/SIL, 경계값분석</w:t>
+            </w:r>
+          </w:p>
+        </w:tc>
+        <w:tc>
+          <w:tcPr>
+            <w:tcW w:type="dxa" w:w="1408"/>
+          </w:tcPr>
+          <w:p>
+            <w:r>
+              <w:t>초안</w:t>
+            </w:r>
+          </w:p>
+        </w:tc>
+      </w:tr>
+      <w:tr>
+        <w:tc>
+          <w:tcPr>
+            <w:tcW w:type="dxa" w:w="1408"/>
+          </w:tcPr>
+          <w:p>
+            <w:r>
+              <w:t>SWR-013b</w:t>
+            </w:r>
+          </w:p>
+        </w:tc>
+        <w:tc>
+          <w:tcPr>
+            <w:tcW w:type="dxa" w:w="1408"/>
+          </w:tcPr>
+          <w:p>
+            <w:r>
+              <w:t>OEM-SR-003</w:t>
+            </w:r>
+          </w:p>
+        </w:tc>
+        <w:tc>
+          <w:tcPr>
+            <w:tcW w:type="dxa" w:w="1408"/>
+          </w:tcPr>
+          <w:p>
+            <w:r>
+              <w:t>안전 관련 입력이 정의된 형식 또는 범위를 벗어나면, SW는 그 입력을 판단 로직에 반영하기 전에 거절해야 한다.</w:t>
+            </w:r>
+          </w:p>
+        </w:tc>
+        <w:tc>
+          <w:tcPr>
+            <w:tcW w:type="dxa" w:w="1408"/>
+          </w:tcPr>
+          <w:p>
+            <w:r>
+              <w:t>유효/무효 범위 각각에서 거절 여부가 사양(OEM-IF-002/003/009)과 일치.</w:t>
+            </w:r>
+          </w:p>
+        </w:tc>
+        <w:tc>
+          <w:tcPr>
+            <w:tcW w:type="dxa" w:w="1408"/>
+          </w:tcPr>
+          <w:p>
+            <w:r>
+              <w:t>ASIL B / 안전목표 TBD. (원자성 분리: OEM-SR-003 → SWR-013a/013b)</w:t>
+            </w:r>
+          </w:p>
+        </w:tc>
+        <w:tc>
+          <w:tcPr>
+            <w:tcW w:type="dxa" w:w="1408"/>
+          </w:tcPr>
+          <w:p>
+            <w:r>
+              <w:t>PC/SIL, 동등분할+경계값</w:t>
+            </w:r>
+          </w:p>
+        </w:tc>
+        <w:tc>
+          <w:tcPr>
+            <w:tcW w:type="dxa" w:w="1408"/>
+          </w:tcPr>
+          <w:p>
+            <w:r>
+              <w:t>초안</w:t>
+            </w:r>
+          </w:p>
+        </w:tc>
+      </w:tr>
+      <w:tr>
+        <w:tc>
+          <w:tcPr>
+            <w:tcW w:type="dxa" w:w="1408"/>
+          </w:tcPr>
+          <w:p>
+            <w:r>
+              <w:t>SWR-021a</w:t>
+            </w:r>
+          </w:p>
+        </w:tc>
+        <w:tc>
+          <w:tcPr>
+            <w:tcW w:type="dxa" w:w="1408"/>
+          </w:tcPr>
+          <w:p>
+            <w:r>
+              <w:t>OEM-SR-004</w:t>
+            </w:r>
+          </w:p>
+        </w:tc>
+        <w:tc>
+          <w:tcPr>
+            <w:tcW w:type="dxa" w:w="1408"/>
+          </w:tcPr>
+          <w:p>
+            <w:r>
+              <w:t>정규화된 sensor_fault 입력이 TRUE인 평가주기 동안, SW는 새로운 명령을 적용하지 않고 직전에 확정된 좌/우 출력을 유지해야 한다.</w:t>
+            </w:r>
+          </w:p>
+        </w:tc>
+        <w:tc>
+          <w:tcPr>
+            <w:tcW w:type="dxa" w:w="1408"/>
+          </w:tcPr>
+          <w:p>
+            <w:r>
+              <w:t>sensor_fault=TRUE 첫 평가주기부터 좌/우 출력 불변(직전 확정값 유지).</w:t>
+            </w:r>
+          </w:p>
+        </w:tc>
+        <w:tc>
+          <w:tcPr>
+            <w:tcW w:type="dxa" w:w="1408"/>
+          </w:tcPr>
+          <w:p>
+            <w:r>
+              <w:t>ASIL B / 안전목표 TBD. (원자성 분리: OEM-SR-004 → SWR-021a/021b)</w:t>
+            </w:r>
+          </w:p>
+        </w:tc>
+        <w:tc>
+          <w:tcPr>
+            <w:tcW w:type="dxa" w:w="1408"/>
+          </w:tcPr>
+          <w:p>
+            <w:r>
+              <w:t>PC/SIL, 요구사항 기반 시험</w:t>
+            </w:r>
+          </w:p>
+        </w:tc>
+        <w:tc>
+          <w:tcPr>
+            <w:tcW w:type="dxa" w:w="1408"/>
+          </w:tcPr>
+          <w:p>
+            <w:r>
+              <w:t>초안</w:t>
+            </w:r>
+          </w:p>
+        </w:tc>
+      </w:tr>
+      <w:tr>
+        <w:tc>
+          <w:tcPr>
+            <w:tcW w:type="dxa" w:w="1408"/>
+          </w:tcPr>
+          <w:p>
+            <w:r>
+              <w:t>SWR-021b</w:t>
+            </w:r>
+          </w:p>
+        </w:tc>
+        <w:tc>
+          <w:tcPr>
+            <w:tcW w:type="dxa" w:w="1408"/>
+          </w:tcPr>
+          <w:p>
+            <w:r>
+              <w:t>OEM-SR-004</w:t>
+            </w:r>
+          </w:p>
+        </w:tc>
+        <w:tc>
+          <w:tcPr>
+            <w:tcW w:type="dxa" w:w="1408"/>
+          </w:tcPr>
+          <w:p>
+            <w:r>
+              <w:t>sensor_fault가 TRUE로 전이하면, SW는 시스템 상태를 FAULT로 설정하고 정의된 경고코드를 제공해야 한다.</w:t>
+            </w:r>
+          </w:p>
+        </w:tc>
+        <w:tc>
+          <w:tcPr>
+            <w:tcW w:type="dxa" w:w="1408"/>
+          </w:tcPr>
+          <w:p>
+            <w:r>
+              <w:t>TRUE 전이 첫 평가주기에 상태=FAULT 및 경고코드 필드가 비어있지 않음.</w:t>
+            </w:r>
+          </w:p>
+        </w:tc>
+        <w:tc>
+          <w:tcPr>
+            <w:tcW w:type="dxa" w:w="1408"/>
+          </w:tcPr>
+          <w:p>
+            <w:r>
+              <w:t>ASIL B / 안전목표 TBD. 비고: 경고코드의 구체 스키마(열거값)는 상세설계(SWE.3)에서 정의한다 — 이번 phase는 코드 존재 요건만 규정한다. (원자성 분리: OEM-SR-004 → SWR-021a/021b)</w:t>
+            </w:r>
+          </w:p>
+        </w:tc>
+        <w:tc>
+          <w:tcPr>
+            <w:tcW w:type="dxa" w:w="1408"/>
+          </w:tcPr>
+          <w:p>
+            <w:r>
+              <w:t>PC/SIL, 요구사항 기반 시험</w:t>
+            </w:r>
+          </w:p>
+        </w:tc>
+        <w:tc>
+          <w:tcPr>
+            <w:tcW w:type="dxa" w:w="1408"/>
+          </w:tcPr>
+          <w:p>
+            <w:r>
+              <w:t>초안</w:t>
+            </w:r>
+          </w:p>
+        </w:tc>
+      </w:tr>
+    </w:tbl>
     <w:p>
       <w:pPr>
         <w:pStyle w:val="Heading1"/>
@@ -1138,16 +1934,352 @@
         <w:ind w:left="198" w:right="113"/>
       </w:pPr>
       <w:r>
-        <w:rPr>
-          <w:rFonts w:ascii="맑은 고딕" w:hAnsi="맑은 고딕" w:eastAsia="맑은 고딕"/>
-          <w:b w:val="0"/>
-          <w:i/>
-          <w:color w:val="595959"/>
-          <w:sz w:val="19"/>
-        </w:rPr>
-        <w:t>작성 안내: 입력 신호와 데이터의 명칭, 자료형, 단위, 범위, 유효성 조건과 오류 처리를 정의한다.</w:t>
+        <w:t>이번 phase(SR-001~004)가 참조하는 입력 신호는 다음과 같다. 전 입력은 SWR-013a/013b의 유효성·freshness 규칙을 공통으로 적용받는다.</w:t>
       </w:r>
     </w:p>
+    <w:tbl>
+      <w:tblPr>
+        <w:tblStyle w:val="TableGrid"/>
+        <w:tblW w:type="auto" w:w="0"/>
+        <w:tblLook w:firstColumn="1" w:firstRow="1" w:lastColumn="0" w:lastRow="0" w:noHBand="0" w:noVBand="1" w:val="04A0"/>
+      </w:tblPr>
+      <w:tblGrid>
+        <w:gridCol w:w="1643"/>
+        <w:gridCol w:w="1643"/>
+        <w:gridCol w:w="1643"/>
+        <w:gridCol w:w="1643"/>
+        <w:gridCol w:w="1643"/>
+        <w:gridCol w:w="1643"/>
+      </w:tblGrid>
+      <w:tr>
+        <w:tc>
+          <w:tcPr>
+            <w:tcW w:type="dxa" w:w="1643"/>
+          </w:tcPr>
+          <w:p>
+            <w:r>
+              <w:rPr>
+                <w:b/>
+              </w:rPr>
+              <w:t>명칭</w:t>
+            </w:r>
+          </w:p>
+        </w:tc>
+        <w:tc>
+          <w:tcPr>
+            <w:tcW w:type="dxa" w:w="1643"/>
+          </w:tcPr>
+          <w:p>
+            <w:r>
+              <w:rPr>
+                <w:b/>
+              </w:rPr>
+              <w:t>자료형/단위</w:t>
+            </w:r>
+          </w:p>
+        </w:tc>
+        <w:tc>
+          <w:tcPr>
+            <w:tcW w:type="dxa" w:w="1643"/>
+          </w:tcPr>
+          <w:p>
+            <w:r>
+              <w:rPr>
+                <w:b/>
+              </w:rPr>
+              <w:t>유효범위</w:t>
+            </w:r>
+          </w:p>
+        </w:tc>
+        <w:tc>
+          <w:tcPr>
+            <w:tcW w:type="dxa" w:w="1643"/>
+          </w:tcPr>
+          <w:p>
+            <w:r>
+              <w:rPr>
+                <w:b/>
+              </w:rPr>
+              <w:t>freshness 요구</w:t>
+            </w:r>
+          </w:p>
+        </w:tc>
+        <w:tc>
+          <w:tcPr>
+            <w:tcW w:type="dxa" w:w="1643"/>
+          </w:tcPr>
+          <w:p>
+            <w:r>
+              <w:rPr>
+                <w:b/>
+              </w:rPr>
+              <w:t>오류 처리</w:t>
+            </w:r>
+          </w:p>
+        </w:tc>
+        <w:tc>
+          <w:tcPr>
+            <w:tcW w:type="dxa" w:w="1643"/>
+          </w:tcPr>
+          <w:p>
+            <w:r>
+              <w:rPr>
+                <w:b/>
+              </w:rPr>
+              <w:t>출처</w:t>
+            </w:r>
+          </w:p>
+        </w:tc>
+      </w:tr>
+      <w:tr>
+        <w:tc>
+          <w:tcPr>
+            <w:tcW w:type="dxa" w:w="1643"/>
+          </w:tcPr>
+          <w:p>
+            <w:r>
+              <w:t>crash_status</w:t>
+            </w:r>
+          </w:p>
+        </w:tc>
+        <w:tc>
+          <w:tcPr>
+            <w:tcW w:type="dxa" w:w="1643"/>
+          </w:tcPr>
+          <w:p>
+            <w:r>
+              <w:t>enum</w:t>
+            </w:r>
+          </w:p>
+        </w:tc>
+        <w:tc>
+          <w:tcPr>
+            <w:tcW w:type="dxa" w:w="1643"/>
+          </w:tcPr>
+          <w:p>
+            <w:r>
+              <w:t>{NONE, PENDING, CONFIRMED}</w:t>
+            </w:r>
+          </w:p>
+        </w:tc>
+        <w:tc>
+          <w:tcPr>
+            <w:tcW w:type="dxa" w:w="1643"/>
+          </w:tcPr>
+          <w:p>
+            <w:r>
+              <w:t>SWR-013a 규칙 적용(200ms)</w:t>
+            </w:r>
+          </w:p>
+        </w:tc>
+        <w:tc>
+          <w:tcPr>
+            <w:tcW w:type="dxa" w:w="1643"/>
+          </w:tcPr>
+          <w:p>
+            <w:r>
+              <w:t>미정의 값 → INVALID(거절)</w:t>
+            </w:r>
+          </w:p>
+        </w:tc>
+        <w:tc>
+          <w:tcPr>
+            <w:tcW w:type="dxa" w:w="1643"/>
+          </w:tcPr>
+          <w:p>
+            <w:r>
+              <w:t>OEM-IF-002</w:t>
+            </w:r>
+          </w:p>
+        </w:tc>
+      </w:tr>
+      <w:tr>
+        <w:tc>
+          <w:tcPr>
+            <w:tcW w:type="dxa" w:w="1643"/>
+          </w:tcPr>
+          <w:p>
+            <w:r>
+              <w:t>rear_left_approach_risk</w:t>
+            </w:r>
+          </w:p>
+        </w:tc>
+        <w:tc>
+          <w:tcPr>
+            <w:tcW w:type="dxa" w:w="1643"/>
+          </w:tcPr>
+          <w:p>
+            <w:r>
+              <w:t>boolean</w:t>
+            </w:r>
+          </w:p>
+        </w:tc>
+        <w:tc>
+          <w:tcPr>
+            <w:tcW w:type="dxa" w:w="1643"/>
+          </w:tcPr>
+          <w:p>
+            <w:r>
+              <w:t>{true, false}</w:t>
+            </w:r>
+          </w:p>
+        </w:tc>
+        <w:tc>
+          <w:tcPr>
+            <w:tcW w:type="dxa" w:w="1643"/>
+          </w:tcPr>
+          <w:p>
+            <w:r>
+              <w:t>SWR-013a 규칙 적용(200ms)</w:t>
+            </w:r>
+          </w:p>
+        </w:tc>
+        <w:tc>
+          <w:tcPr>
+            <w:tcW w:type="dxa" w:w="1643"/>
+          </w:tcPr>
+          <w:p>
+            <w:r>
+              <w:t>누락/형식 오류 → INVALID(거절)</w:t>
+            </w:r>
+          </w:p>
+        </w:tc>
+        <w:tc>
+          <w:tcPr>
+            <w:tcW w:type="dxa" w:w="1643"/>
+          </w:tcPr>
+          <w:p>
+            <w:r>
+              <w:t>OEM-IF-003</w:t>
+            </w:r>
+          </w:p>
+        </w:tc>
+      </w:tr>
+      <w:tr>
+        <w:tc>
+          <w:tcPr>
+            <w:tcW w:type="dxa" w:w="1643"/>
+          </w:tcPr>
+          <w:p>
+            <w:r>
+              <w:t>rear_right_approach_risk</w:t>
+            </w:r>
+          </w:p>
+        </w:tc>
+        <w:tc>
+          <w:tcPr>
+            <w:tcW w:type="dxa" w:w="1643"/>
+          </w:tcPr>
+          <w:p>
+            <w:r>
+              <w:t>boolean</w:t>
+            </w:r>
+          </w:p>
+        </w:tc>
+        <w:tc>
+          <w:tcPr>
+            <w:tcW w:type="dxa" w:w="1643"/>
+          </w:tcPr>
+          <w:p>
+            <w:r>
+              <w:t>{true, false}</w:t>
+            </w:r>
+          </w:p>
+        </w:tc>
+        <w:tc>
+          <w:tcPr>
+            <w:tcW w:type="dxa" w:w="1643"/>
+          </w:tcPr>
+          <w:p>
+            <w:r>
+              <w:t>SWR-013a 규칙 적용(200ms)</w:t>
+            </w:r>
+          </w:p>
+        </w:tc>
+        <w:tc>
+          <w:tcPr>
+            <w:tcW w:type="dxa" w:w="1643"/>
+          </w:tcPr>
+          <w:p>
+            <w:r>
+              <w:t>누락/형식 오류 → INVALID(거절)</w:t>
+            </w:r>
+          </w:p>
+        </w:tc>
+        <w:tc>
+          <w:tcPr>
+            <w:tcW w:type="dxa" w:w="1643"/>
+          </w:tcPr>
+          <w:p>
+            <w:r>
+              <w:t>OEM-IF-003</w:t>
+            </w:r>
+          </w:p>
+        </w:tc>
+      </w:tr>
+      <w:tr>
+        <w:tc>
+          <w:tcPr>
+            <w:tcW w:type="dxa" w:w="1643"/>
+          </w:tcPr>
+          <w:p>
+            <w:r>
+              <w:t>sensor_fault</w:t>
+            </w:r>
+          </w:p>
+        </w:tc>
+        <w:tc>
+          <w:tcPr>
+            <w:tcW w:type="dxa" w:w="1643"/>
+          </w:tcPr>
+          <w:p>
+            <w:r>
+              <w:t>boolean</w:t>
+            </w:r>
+          </w:p>
+        </w:tc>
+        <w:tc>
+          <w:tcPr>
+            <w:tcW w:type="dxa" w:w="1643"/>
+          </w:tcPr>
+          <w:p>
+            <w:r>
+              <w:t>{true, false}</w:t>
+            </w:r>
+          </w:p>
+        </w:tc>
+        <w:tc>
+          <w:tcPr>
+            <w:tcW w:type="dxa" w:w="1643"/>
+          </w:tcPr>
+          <w:p>
+            <w:r>
+              <w:t>SWR-013a 규칙 적용(200ms)</w:t>
+            </w:r>
+          </w:p>
+        </w:tc>
+        <w:tc>
+          <w:tcPr>
+            <w:tcW w:type="dxa" w:w="1643"/>
+          </w:tcPr>
+          <w:p>
+            <w:r>
+              <w:t>누락/형식 오류 → INVALID(거절)</w:t>
+            </w:r>
+          </w:p>
+        </w:tc>
+        <w:tc>
+          <w:tcPr>
+            <w:tcW w:type="dxa" w:w="1643"/>
+          </w:tcPr>
+          <w:p>
+            <w:r>
+              <w:t>OEM-IF-009(일부; ignition_on은 Phase 2)</w:t>
+            </w:r>
+          </w:p>
+        </w:tc>
+      </w:tr>
+    </w:tbl>
     <w:p>
       <w:pPr>
         <w:pStyle w:val="Heading1"/>
@@ -1162,16 +2294,246 @@
         <w:ind w:left="198" w:right="113"/>
       </w:pPr>
       <w:r>
-        <w:rPr>
-          <w:rFonts w:ascii="맑은 고딕" w:hAnsi="맑은 고딕" w:eastAsia="맑은 고딕"/>
-          <w:b w:val="0"/>
-          <w:i/>
-          <w:color w:val="595959"/>
-          <w:sz w:val="19"/>
-        </w:rPr>
-        <w:t>작성 안내: 외부 시스템, 하드웨어, 통신 또는 사용자 인터페이스별 입력, 출력과 오류 계약을 작성한다.</w:t>
+        <w:t>이번 phase가 사용하는 외부 인터페이스는 OEM-SWR-001 6장의 정의를 그대로 인용한다. CAN/LIN 드라이버 등 물리 계층 구현은 범위 밖이다.</w:t>
       </w:r>
     </w:p>
+    <w:tbl>
+      <w:tblPr>
+        <w:tblStyle w:val="TableGrid"/>
+        <w:tblW w:type="auto" w:w="0"/>
+        <w:tblLook w:firstColumn="1" w:firstRow="1" w:lastColumn="0" w:lastRow="0" w:noHBand="0" w:noVBand="1" w:val="04A0"/>
+      </w:tblPr>
+      <w:tblGrid>
+        <w:gridCol w:w="1972"/>
+        <w:gridCol w:w="1972"/>
+        <w:gridCol w:w="1972"/>
+        <w:gridCol w:w="1972"/>
+        <w:gridCol w:w="1972"/>
+      </w:tblGrid>
+      <w:tr>
+        <w:tc>
+          <w:tcPr>
+            <w:tcW w:type="dxa" w:w="1972"/>
+          </w:tcPr>
+          <w:p>
+            <w:r>
+              <w:rPr>
+                <w:b/>
+              </w:rPr>
+              <w:t>인터페이스 ID</w:t>
+            </w:r>
+          </w:p>
+        </w:tc>
+        <w:tc>
+          <w:tcPr>
+            <w:tcW w:type="dxa" w:w="1972"/>
+          </w:tcPr>
+          <w:p>
+            <w:r>
+              <w:rPr>
+                <w:b/>
+              </w:rPr>
+              <w:t>방향</w:t>
+            </w:r>
+          </w:p>
+        </w:tc>
+        <w:tc>
+          <w:tcPr>
+            <w:tcW w:type="dxa" w:w="1972"/>
+          </w:tcPr>
+          <w:p>
+            <w:r>
+              <w:rPr>
+                <w:b/>
+              </w:rPr>
+              <w:t>데이터</w:t>
+            </w:r>
+          </w:p>
+        </w:tc>
+        <w:tc>
+          <w:tcPr>
+            <w:tcW w:type="dxa" w:w="1972"/>
+          </w:tcPr>
+          <w:p>
+            <w:r>
+              <w:rPr>
+                <w:b/>
+              </w:rPr>
+              <w:t>공급자(우리) 책임</w:t>
+            </w:r>
+          </w:p>
+        </w:tc>
+        <w:tc>
+          <w:tcPr>
+            <w:tcW w:type="dxa" w:w="1972"/>
+          </w:tcPr>
+          <w:p>
+            <w:r>
+              <w:rPr>
+                <w:b/>
+              </w:rPr>
+              <w:t>제외</w:t>
+            </w:r>
+          </w:p>
+        </w:tc>
+      </w:tr>
+      <w:tr>
+        <w:tc>
+          <w:tcPr>
+            <w:tcW w:type="dxa" w:w="1972"/>
+          </w:tcPr>
+          <w:p>
+            <w:r>
+              <w:t>OEM-IF-002</w:t>
+            </w:r>
+          </w:p>
+        </w:tc>
+        <w:tc>
+          <w:tcPr>
+            <w:tcW w:type="dxa" w:w="1972"/>
+          </w:tcPr>
+          <w:p>
+            <w:r>
+              <w:t>Vehicle→SW</w:t>
+            </w:r>
+          </w:p>
+        </w:tc>
+        <w:tc>
+          <w:tcPr>
+            <w:tcW w:type="dxa" w:w="1972"/>
+          </w:tcPr>
+          <w:p>
+            <w:r>
+              <w:t>crash_status</w:t>
+            </w:r>
+          </w:p>
+        </w:tc>
+        <w:tc>
+          <w:tcPr>
+            <w:tcW w:type="dxa" w:w="1972"/>
+          </w:tcPr>
+          <w:p>
+            <w:r>
+              <w:t>범위/형식 검증, SWR-007/008 판단</w:t>
+            </w:r>
+          </w:p>
+        </w:tc>
+        <w:tc>
+          <w:tcPr>
+            <w:tcW w:type="dxa" w:w="1972"/>
+          </w:tcPr>
+          <w:p>
+            <w:r>
+              <w:t>센서 신뢰성 자체는 Vehicle 책임</w:t>
+            </w:r>
+          </w:p>
+        </w:tc>
+      </w:tr>
+      <w:tr>
+        <w:tc>
+          <w:tcPr>
+            <w:tcW w:type="dxa" w:w="1972"/>
+          </w:tcPr>
+          <w:p>
+            <w:r>
+              <w:t>OEM-IF-003</w:t>
+            </w:r>
+          </w:p>
+        </w:tc>
+        <w:tc>
+          <w:tcPr>
+            <w:tcW w:type="dxa" w:w="1972"/>
+          </w:tcPr>
+          <w:p>
+            <w:r>
+              <w:t>Vehicle→SW</w:t>
+            </w:r>
+          </w:p>
+        </w:tc>
+        <w:tc>
+          <w:tcPr>
+            <w:tcW w:type="dxa" w:w="1972"/>
+          </w:tcPr>
+          <w:p>
+            <w:r>
+              <w:t>rear_left/right_approach_risk</w:t>
+            </w:r>
+          </w:p>
+        </w:tc>
+        <w:tc>
+          <w:tcPr>
+            <w:tcW w:type="dxa" w:w="1972"/>
+          </w:tcPr>
+          <w:p>
+            <w:r>
+              <w:t>범위/형식 검증, SWR-005/006/009 판단</w:t>
+            </w:r>
+          </w:p>
+        </w:tc>
+        <w:tc>
+          <w:tcPr>
+            <w:tcW w:type="dxa" w:w="1972"/>
+          </w:tcPr>
+          <w:p>
+            <w:r>
+              <w:t>접근위험 판정 알고리즘 자체는 Vehicle 책임</w:t>
+            </w:r>
+          </w:p>
+        </w:tc>
+      </w:tr>
+      <w:tr>
+        <w:tc>
+          <w:tcPr>
+            <w:tcW w:type="dxa" w:w="1972"/>
+          </w:tcPr>
+          <w:p>
+            <w:r>
+              <w:t>OEM-IF-009</w:t>
+            </w:r>
+          </w:p>
+        </w:tc>
+        <w:tc>
+          <w:tcPr>
+            <w:tcW w:type="dxa" w:w="1972"/>
+          </w:tcPr>
+          <w:p>
+            <w:r>
+              <w:t>Vehicle→SW</w:t>
+            </w:r>
+          </w:p>
+        </w:tc>
+        <w:tc>
+          <w:tcPr>
+            <w:tcW w:type="dxa" w:w="1972"/>
+          </w:tcPr>
+          <w:p>
+            <w:r>
+              <w:t>sensor_fault (ignition_on은 Phase 2)</w:t>
+            </w:r>
+          </w:p>
+        </w:tc>
+        <w:tc>
+          <w:tcPr>
+            <w:tcW w:type="dxa" w:w="1972"/>
+          </w:tcPr>
+          <w:p>
+            <w:r>
+              <w:t>범위/형식 검증, SWR-021a/021b 판단</w:t>
+            </w:r>
+          </w:p>
+        </w:tc>
+        <w:tc>
+          <w:tcPr>
+            <w:tcW w:type="dxa" w:w="1972"/>
+          </w:tcPr>
+          <w:p>
+            <w:r>
+              <w:t>센서 고장 진단 로직 자체는 Vehicle 책임</w:t>
+            </w:r>
+          </w:p>
+        </w:tc>
+      </w:tr>
+    </w:tbl>
     <w:p>
       <w:pPr>
         <w:pStyle w:val="Heading1"/>
@@ -1186,14 +2548,15 @@
         <w:ind w:left="198" w:right="113"/>
       </w:pPr>
       <w:r>
+        <w:t>실행 환경: Python 3.14, PC/SIL(이 프로젝트 unittest+integration-tester+sw-system-tester 파이프라인). OEM 사양서는 Python 3.12를 명시했으나, 인터페이스 데이터 형식에 영향이 없다고 판단해 이 프로젝트의 CLAUDE.md 정책(Python 3.14)을 그대로 따르기로 사용자가 확정했다(2026-09-18).</w:t>
+      </w:r>
+    </w:p>
+    <w:p>
+      <w:r>
         <w:rPr>
-          <w:rFonts w:ascii="맑은 고딕" w:hAnsi="맑은 고딕" w:eastAsia="맑은 고딕"/>
           <w:b w:val="0"/>
-          <w:i/>
-          <w:color w:val="595959"/>
-          <w:sz w:val="19"/>
         </w:rPr>
-        <w:t>작성 안내: 성능, 자원, 신뢰성, 사용 환경, 도구와 플랫폼 제약을 측정 가능한 기준으로 기록한다.</w:t>
+        <w:t>타이밍 제약: 충돌 감지→해제 300ms 이내(SWR-007), freshness 임계 200ms(SWR-013a), DEGRADED 전이 100ms 이내(SWR-013a) — 실행 환경의 시각 정밀도가 이 임계값을 안정적으로 측정할 수 있어야 한다.</w:t>
       </w:r>
     </w:p>
     <w:p>
@@ -1210,14 +2573,63 @@
         <w:ind w:left="198" w:right="113"/>
       </w:pPr>
       <w:r>
+        <w:t>가정 1(2026-09-18 사용자 확정): crash_status=CONFIRMED가 접근위험으로 인한 잠금 유지보다 우선한다. 근거 - 충돌 후 차량이 정지 상태이므로 접근위험(주행 중 타 차량 근접)의 실효성이 낮아지고, OEM-SR-001 원문이 "다른 명령보다 우선"을 명시한다.</w:t>
+      </w:r>
+    </w:p>
+    <w:p>
+      <w:r>
         <w:rPr>
-          <w:rFonts w:ascii="맑은 고딕" w:hAnsi="맑은 고딕" w:eastAsia="맑은 고딕"/>
           <w:b w:val="0"/>
-          <w:i/>
-          <w:color w:val="595959"/>
-          <w:sz w:val="19"/>
         </w:rPr>
-        <w:t>작성 안내: 요구사항 분석에서 확인한 가정, 의존성, 상충 사항과 미결정을 기록한다.</w:t>
+        <w:t>가정 2(2026-09-18 사용자 확정, 재확인 필요): crash_status=PENDING은 NONE과 동일하게 취급한다(가장 보수적 해석). OEM 원문에 PENDING 처리 의도가 명시되어 있지 않으므로, 실제 OEM에는 이 가정을 재질의해야 한다(SWR-008 근거).</w:t>
+      </w:r>
+    </w:p>
+    <w:p>
+      <w:r>
+        <w:rPr>
+          <w:b w:val="0"/>
+        </w:rPr>
+        <w:t>가정 3(2026-09-18 사용자 확정): "PC/SIL SW 검증"은 별도 상용 툴체인이 아니라 이 프로젝트의 Python 시뮬레이션 + unittest/integration-tester/sw-system-tester 파이프라인으로 갈음한다.</w:t>
+      </w:r>
+    </w:p>
+    <w:p>
+      <w:r>
+        <w:rPr>
+          <w:b w:val="0"/>
+        </w:rPr>
+        <w:t>가정 4(2026-09-18 사용자 확정): 원자성 원칙에 따라 SWR-013→SWR-013a/013b, SWR-021→SWR-021a/021b로 분리하고, 상위 ID는 OEM 추적표 대조용 그룹 ID로 유지한다.</w:t>
+      </w:r>
+    </w:p>
+    <w:p>
+      <w:r>
+        <w:rPr>
+          <w:b w:val="0"/>
+        </w:rPr>
+        <w:t>미결정/재확인 필요 사항 —</w:t>
+      </w:r>
+    </w:p>
+    <w:p>
+      <w:r>
+        <w:rPr>
+          <w:b w:val="0"/>
+        </w:rPr>
+        <w:t>(1) SWR-019 결번: OEM-SWR-001 9장 추적성표(13개 OEM 요구사항 전체)에 SWR-001~021 중 019가 어디에도 나타나지 않는다. 결번인지 문서 누락인지 OEM에 확인이 필요하며, 공급자가 임의로 채우지 않는다.</w:t>
+      </w:r>
+    </w:p>
+    <w:p>
+      <w:r>
+        <w:rPr>
+          <w:b w:val="0"/>
+        </w:rPr>
+        <w:t>(2) SWR-021b의 경고코드 구체 스키마(열거값)는 상세설계(SWE.3)에서 정의한다.</w:t>
+      </w:r>
+    </w:p>
+    <w:p>
+      <w:r>
+        <w:rPr>
+          <w:b w:val="0"/>
+        </w:rPr>
+        <w:t>(3) SWR-005/006/007/008/009/013a/013b/021a/021b의 안전목표(Safety Goal) 식별자는 OEM이 아직 제공하지 않았다(ASIL 등급만 입력받음) — HARA 재구성 금지 원칙에 따라 공급자가 임의로 생성하지 않는다.</w:t>
       </w:r>
     </w:p>
     <w:p>
@@ -1234,16 +2646,142 @@
         <w:ind w:left="198" w:right="113"/>
       </w:pPr>
       <w:r>
-        <w:rPr>
-          <w:rFonts w:ascii="맑은 고딕" w:hAnsi="맑은 고딕" w:eastAsia="맑은 고딕"/>
-          <w:b w:val="0"/>
-          <w:i/>
-          <w:color w:val="595959"/>
-          <w:sz w:val="19"/>
-        </w:rPr>
-        <w:t>작성 안내: 요구사항별 설계 할당 대상, 검증 수준, 방법과 계획된 증거를 연결한다.</w:t>
+        <w:t>이번 리비전 시점에는 아키텍처가 아직 없으므로 설계 할당 대상은 TBD이며, 다음 단계(architecture-designer)에서 확정한다.</w:t>
       </w:r>
     </w:p>
+    <w:tbl>
+      <w:tblPr>
+        <w:tblStyle w:val="TableGrid"/>
+        <w:tblW w:type="auto" w:w="0"/>
+        <w:tblLook w:firstColumn="1" w:firstRow="1" w:lastColumn="0" w:lastRow="0" w:noHBand="0" w:noVBand="1" w:val="04A0"/>
+      </w:tblPr>
+      <w:tblGrid>
+        <w:gridCol w:w="1972"/>
+        <w:gridCol w:w="1972"/>
+        <w:gridCol w:w="1972"/>
+        <w:gridCol w:w="1972"/>
+        <w:gridCol w:w="1972"/>
+      </w:tblGrid>
+      <w:tr>
+        <w:tc>
+          <w:tcPr>
+            <w:tcW w:type="dxa" w:w="1972"/>
+          </w:tcPr>
+          <w:p>
+            <w:r>
+              <w:rPr>
+                <w:b/>
+              </w:rPr>
+              <w:t>SWR ID</w:t>
+            </w:r>
+          </w:p>
+        </w:tc>
+        <w:tc>
+          <w:tcPr>
+            <w:tcW w:type="dxa" w:w="1972"/>
+          </w:tcPr>
+          <w:p>
+            <w:r>
+              <w:rPr>
+                <w:b/>
+              </w:rPr>
+              <w:t>설계 할당 대상</w:t>
+            </w:r>
+          </w:p>
+        </w:tc>
+        <w:tc>
+          <w:tcPr>
+            <w:tcW w:type="dxa" w:w="1972"/>
+          </w:tcPr>
+          <w:p>
+            <w:r>
+              <w:rPr>
+                <w:b/>
+              </w:rPr>
+              <w:t>검증 수준</w:t>
+            </w:r>
+          </w:p>
+        </w:tc>
+        <w:tc>
+          <w:tcPr>
+            <w:tcW w:type="dxa" w:w="1972"/>
+          </w:tcPr>
+          <w:p>
+            <w:r>
+              <w:rPr>
+                <w:b/>
+              </w:rPr>
+              <w:t>검증 방법</w:t>
+            </w:r>
+          </w:p>
+        </w:tc>
+        <w:tc>
+          <w:tcPr>
+            <w:tcW w:type="dxa" w:w="1972"/>
+          </w:tcPr>
+          <w:p>
+            <w:r>
+              <w:rPr>
+                <w:b/>
+              </w:rPr>
+              <w:t>계획된 증거</w:t>
+            </w:r>
+          </w:p>
+        </w:tc>
+      </w:tr>
+      <w:tr>
+        <w:tc>
+          <w:tcPr>
+            <w:tcW w:type="dxa" w:w="1972"/>
+          </w:tcPr>
+          <w:p>
+            <w:r>
+              <w:t>SWR-005/006/007/008/009/013a/013b/021a/021b</w:t>
+            </w:r>
+          </w:p>
+        </w:tc>
+        <w:tc>
+          <w:tcPr>
+            <w:tcW w:type="dxa" w:w="1972"/>
+          </w:tcPr>
+          <w:p>
+            <w:r>
+              <w:t>TBD(Phase 1 아키텍처 설계 단계에서 확정)</w:t>
+            </w:r>
+          </w:p>
+        </w:tc>
+        <w:tc>
+          <w:tcPr>
+            <w:tcW w:type="dxa" w:w="1972"/>
+          </w:tcPr>
+          <w:p>
+            <w:r>
+              <w:t>PC/SIL</w:t>
+            </w:r>
+          </w:p>
+        </w:tc>
+        <w:tc>
+          <w:tcPr>
+            <w:tcW w:type="dxa" w:w="1972"/>
+          </w:tcPr>
+          <w:p>
+            <w:r>
+              <w:t>unittest(단위) + integration-tester(통합) + sw-system-tester(시스템)</w:t>
+            </w:r>
+          </w:p>
+        </w:tc>
+        <w:tc>
+          <w:tcPr>
+            <w:tcW w:type="dxa" w:w="1972"/>
+          </w:tcPr>
+          <w:p>
+            <w:r>
+              <w:t>TPL-SWE5-002/003, TPL-SWE6-001/002 (Phase 1 이후 단계에서 생성)</w:t>
+            </w:r>
+          </w:p>
+        </w:tc>
+      </w:tr>
+    </w:tbl>
     <w:p>
       <w:pPr>
         <w:pStyle w:val="Heading1"/>
@@ -1258,14 +2796,7 @@
         <w:ind w:left="198" w:right="113"/>
       </w:pPr>
       <w:r>
-        <w:rPr>
-          <w:rFonts w:ascii="맑은 고딕" w:hAnsi="맑은 고딕" w:eastAsia="맑은 고딕"/>
-          <w:b w:val="0"/>
-          <w:i/>
-          <w:color w:val="595959"/>
-          <w:sz w:val="19"/>
-        </w:rPr>
-        <w:t>작성 안내: 이 문서와 관련 증거만으로 주장할 수 없는 시험 수준, 인증 또는 적합성 범위를 명시한다.</w:t>
+        <w:t>본 문서와 관련 증거만으로 HARA, ASIL 도출 근거, ISO 26262 Part 3 준수, 실차/HIL 검증, 공식 인증, 실제 OEM 승인을 주장하지 않는다. 이 프로젝트 전체가 A-SPICE/ISO 26262 학습을 위한 교육용 가상 시나리오 산출물이다(OEM-SWR-001 1페이지 고지사항과 동일한 취지).</w:t>
       </w:r>
     </w:p>
     <w:p>
@@ -1282,14 +2813,15 @@
         <w:ind w:left="198" w:right="113"/>
       </w:pPr>
       <w:r>
+        <w:t>traceability/TRC-001_양방향 요구사항 추적 매트릭스.xlsx 에 OEM-SR-00X ↔ SWR-0NN(서브절 포함) 매핑을 유지한다. 이번 phase의 매핑: OEM-SR-001→SWR-007,008 / OEM-SR-002→SWR-005,006,009 / OEM-SR-003→SWR-013a,013b / OEM-SR-004→SWR-021a,021b. SWR-019는 매핑 근거 미확인 상태로 별도 기록되어 있다.</w:t>
+      </w:r>
+    </w:p>
+    <w:p>
+      <w:r>
         <w:rPr>
-          <w:rFonts w:ascii="맑은 고딕" w:hAnsi="맑은 고딕" w:eastAsia="맑은 고딕"/>
           <w:b w:val="0"/>
-          <w:i/>
-          <w:color w:val="595959"/>
-          <w:sz w:val="19"/>
         </w:rPr>
-        <w:t>작성 안내: 상위 요구사항, Use Case, 설계, 코드와 검증 산출물의 양방향 연결 규칙과 위치를 기록한다.</w:t>
+        <w:t>하위 산출물(아키텍처/상세설계/코드/시험) 열은 모두 TBD이며, 이후 단계마다 반드시 채워 넣는다.</w:t>
       </w:r>
     </w:p>
     <w:p>
@@ -1306,16 +2838,136 @@
         <w:ind w:left="198" w:right="113"/>
       </w:pPr>
       <w:r>
-        <w:rPr>
-          <w:rFonts w:ascii="맑은 고딕" w:hAnsi="맑은 고딕" w:eastAsia="맑은 고딕"/>
-          <w:b w:val="0"/>
-          <w:i/>
-          <w:color w:val="595959"/>
-          <w:sz w:val="19"/>
-        </w:rPr>
-        <w:t>작성 안내: 적용한 표준, 고객 입력, 법규와 기술 자료의 식별정보, 버전과 적용 범위를 적는다.</w:t>
+        <w:t>이번 phase 작성에 적용한 표준·고객 입력 자료는 다음과 같다.</w:t>
       </w:r>
     </w:p>
+    <w:tbl>
+      <w:tblPr>
+        <w:tblStyle w:val="TableGrid"/>
+        <w:tblW w:type="auto" w:w="0"/>
+        <w:tblLook w:firstColumn="1" w:firstRow="1" w:lastColumn="0" w:lastRow="0" w:noHBand="0" w:noVBand="1" w:val="04A0"/>
+      </w:tblPr>
+      <w:tblGrid>
+        <w:gridCol w:w="4929"/>
+        <w:gridCol w:w="4929"/>
+      </w:tblGrid>
+      <w:tr>
+        <w:tc>
+          <w:tcPr>
+            <w:tcW w:type="dxa" w:w="4929"/>
+          </w:tcPr>
+          <w:p>
+            <w:r>
+              <w:rPr>
+                <w:b/>
+              </w:rPr>
+              <w:t>식별자</w:t>
+            </w:r>
+          </w:p>
+        </w:tc>
+        <w:tc>
+          <w:tcPr>
+            <w:tcW w:type="dxa" w:w="4929"/>
+          </w:tcPr>
+          <w:p>
+            <w:r>
+              <w:rPr>
+                <w:b/>
+              </w:rPr>
+              <w:t>참고 목적</w:t>
+            </w:r>
+          </w:p>
+        </w:tc>
+      </w:tr>
+      <w:tr>
+        <w:tc>
+          <w:tcPr>
+            <w:tcW w:type="dxa" w:w="4929"/>
+          </w:tcPr>
+          <w:p>
+            <w:r>
+              <w:t>OEM-SWR-001</w:t>
+            </w:r>
+          </w:p>
+        </w:tc>
+        <w:tc>
+          <w:tcPr>
+            <w:tcW w:type="dxa" w:w="4929"/>
+          </w:tcPr>
+          <w:p>
+            <w:r>
+              <w:t>교육용 가상 OEM 요구사양서(본 문서의 테스트 베이시스)</w:t>
+            </w:r>
+          </w:p>
+        </w:tc>
+      </w:tr>
+      <w:tr>
+        <w:tc>
+          <w:tcPr>
+            <w:tcW w:type="dxa" w:w="4929"/>
+          </w:tcPr>
+          <w:p>
+            <w:r>
+              <w:t>ISO 26262-6:2018</w:t>
+            </w:r>
+          </w:p>
+        </w:tc>
+        <w:tc>
+          <w:tcPr>
+            <w:tcW w:type="dxa" w:w="4929"/>
+          </w:tcPr>
+          <w:p>
+            <w:r>
+              <w:t>프로젝트가 선정한 SW 개발 활동 경계 근거(전체 준수 주장 아님)</w:t>
+            </w:r>
+          </w:p>
+        </w:tc>
+      </w:tr>
+      <w:tr>
+        <w:tc>
+          <w:tcPr>
+            <w:tcW w:type="dxa" w:w="4929"/>
+          </w:tcPr>
+          <w:p>
+            <w:r>
+              <w:t>A-SPICE 4.1 PAM</w:t>
+            </w:r>
+          </w:p>
+        </w:tc>
+        <w:tc>
+          <w:tcPr>
+            <w:tcW w:type="dxa" w:w="4929"/>
+          </w:tcPr>
+          <w:p>
+            <w:r>
+              <w:t>SWE.1 기본관행 대조(조직 공식 문서 확인 필요)</w:t>
+            </w:r>
+          </w:p>
+        </w:tc>
+      </w:tr>
+      <w:tr>
+        <w:tc>
+          <w:tcPr>
+            <w:tcW w:type="dxa" w:w="4929"/>
+          </w:tcPr>
+          <w:p>
+            <w:r>
+              <w:t>CLAUDE.md</w:t>
+            </w:r>
+          </w:p>
+        </w:tc>
+        <w:tc>
+          <w:tcPr>
+            <w:tcW w:type="dxa" w:w="4929"/>
+          </w:tcPr>
+          <w:p>
+            <w:r>
+              <w:t>본 프로젝트 개발 정책(Python 3.14, A-SPICE 파이프라인, 서브에이전트 역할 분담)</w:t>
+            </w:r>
+          </w:p>
+        </w:tc>
+      </w:tr>
+    </w:tbl>
     <w:sectPr>
       <w:footerReference w:type="default" r:id="rId9"/>
       <w:pgSz w:w="12240" w:h="15840"/>

</xml_diff>